<commit_message>
feat: align API payload with condition1 and condition2 specs for Logic 1 and Logic 2
</commit_message>
<xml_diff>
--- a/docs/proposal/ByteWallet_AI_Proposal.docx
+++ b/docs/proposal/ByteWallet_AI_Proposal.docx
@@ -183,6 +183,74 @@
         <w:t>• Tier 2: "Burn-Rate Challenge" Social Media Campaign. Through platforms like TikTok and Instagram Reels (targeting ~500+ youth), a gamified 30-day budgeting challenge will be launched. Short, educational videos will explain simple AI concepts—like 'prediction vs. static rules'—in accessible terms alongside practical budgeting tips and tricks.</w:t>
         <w:br/>
         <w:t>• Tier 3: Open-Source AI Clinics. A community hack-day (targeting ~100 aspiring developers and tech enthusiasts) will be hosted, walking through the ML data loaders to encourage unprecedented algorithmic transparency and local contributions to ethical AI development.</w:t>
+      </w:r>
+    </w:p>
+    <w:p>
+      <w:pPr>
+        <w:pStyle w:val="Heading1"/>
+      </w:pPr>
+      <w:r>
+        <w:t>Appendix: Technical Alignment Update (March 2026)</w:t>
+      </w:r>
+    </w:p>
+    <w:p>
+      <w:pPr>
+        <w:pStyle w:val="Heading2"/>
+      </w:pPr>
+      <w:r>
+        <w:t>1. Logic Alignment &amp; Hybrid Architecture</w:t>
+      </w:r>
+    </w:p>
+    <w:p>
+      <w:r>
+        <w:rPr>
+          <w:b/>
+        </w:rPr>
+        <w:t xml:space="preserve">The ByteWallet AI system now officially incorporates a </w:t>
+      </w:r>
+      <w:r>
+        <w:t>Hybrid Intelligence approach, seamlessly blending rigid financial heuristic rules (Logic 1: Monthly Plan Shortfall, and Logic 2: Mid-Month Check) determined by the frontend with probabilistic machine learning and LLM reasoning on the backend.</w:t>
+      </w:r>
+    </w:p>
+    <w:p>
+      <w:pPr>
+        <w:pStyle w:val="Heading2"/>
+      </w:pPr>
+      <w:r>
+        <w:t>2. System Integration Flow</w:t>
+      </w:r>
+    </w:p>
+    <w:p>
+      <w:r>
+        <w:t>To ensure the AI’s reasoning is numerically sound and immune to hallucination over critical triggers, the system payload between the app and the AI engine has been updated. The frontend now pre-calculates the Logic Signals, User Context, and Recommendation Engine parameters and passes them directly to the AI as ground-truth facts.</w:t>
+      </w:r>
+    </w:p>
+    <w:p>
+      <w:pPr>
+        <w:pStyle w:val="Heading2"/>
+      </w:pPr>
+      <w:r>
+        <w:t>3. The Intelligence Pipeline</w:t>
+      </w:r>
+    </w:p>
+    <w:p>
+      <w:r>
+        <w:t>1. App detects a shortfall (e.g., predicted balance &lt; essential obligations) or mid-month threshold breach.</w:t>
+      </w:r>
+    </w:p>
+    <w:p>
+      <w:r>
+        <w:t>2. App calculates the optimal avoidable category to cut and passes these specific signals to the /v1/predict-burn-rate API.</w:t>
+      </w:r>
+    </w:p>
+    <w:p>
+      <w:r>
+        <w:t>3. The Backend accepts these signals (overriding server-side calculation to stay perfectly synced) and passes them to the Reasoning Layer (LLM).</w:t>
+      </w:r>
+    </w:p>
+    <w:p>
+      <w:r>
+        <w:t>4. The LLM generates perfectly aligned, highly contextual advisory messaging ("ByteCoach").</w:t>
       </w:r>
     </w:p>
     <w:sectPr>

</xml_diff>